<commit_message>
Added +1 of project details
</commit_message>
<xml_diff>
--- a/Sagnik Kundu Resume - Accenture.docx
+++ b/Sagnik Kundu Resume - Accenture.docx
@@ -1037,6 +1037,56 @@
           <w:lang w:val="en-US"/>
         </w:rPr>
         <w:t xml:space="preserve"> including MDM, SAP, ServiceNow, SharePoint, and Azure DevOps.</w:t>
+      </w:r>
+    </w:p>
+    <w:p>
+      <w:pPr>
+        <w:pStyle w:val="ListParagraph"/>
+        <w:numPr>
+          <w:ilvl w:val="0"/>
+          <w:numId w:val="1"/>
+        </w:numPr>
+        <w:spacing w:before="240" w:beforeAutospacing="off" w:after="240" w:afterAutospacing="off"/>
+        <w:jc w:val="both"/>
+        <w:rPr>
+          <w:rFonts w:ascii="Times New Roman" w:hAnsi="Times New Roman" w:eastAsia="Times New Roman" w:cs="Times New Roman"/>
+          <w:noProof w:val="0"/>
+          <w:sz w:val="22"/>
+          <w:szCs w:val="22"/>
+          <w:lang w:val="en-US"/>
+        </w:rPr>
+      </w:pPr>
+      <w:r>
+        <w:rPr>
+          <w:rFonts w:ascii="Times New Roman" w:hAnsi="Times New Roman" w:eastAsia="Times New Roman" w:cs="Times New Roman"/>
+          <w:b w:val="1"/>
+          <w:bCs w:val="1"/>
+          <w:noProof w:val="0"/>
+          <w:sz w:val="22"/>
+          <w:szCs w:val="22"/>
+          <w:lang w:val="en-US"/>
+        </w:rPr>
+        <w:t>Created Power BI DataMart</w:t>
+      </w:r>
+      <w:r>
+        <w:rPr>
+          <w:rFonts w:ascii="Times New Roman" w:hAnsi="Times New Roman" w:eastAsia="Times New Roman" w:cs="Times New Roman"/>
+          <w:noProof w:val="0"/>
+          <w:sz w:val="22"/>
+          <w:szCs w:val="22"/>
+          <w:lang w:val="en-US"/>
+        </w:rPr>
+        <w:t xml:space="preserve"> to enable fully managed, self-service Azure SQL databases that enable users to ingest, transform, and store data, automatically generating a semantic model for reporting</w:t>
+      </w:r>
+      <w:r>
+        <w:rPr>
+          <w:rFonts w:ascii="Times New Roman" w:hAnsi="Times New Roman" w:eastAsia="Times New Roman" w:cs="Times New Roman"/>
+          <w:noProof w:val="0"/>
+          <w:sz w:val="22"/>
+          <w:szCs w:val="22"/>
+          <w:lang w:val="en-US"/>
+        </w:rPr>
+        <w:t xml:space="preserve"> with centralized Row-Level Security (RLS) in Power BI Services.</w:t>
       </w:r>
     </w:p>
     <w:p>

</xml_diff>